<commit_message>
Evaristo Costa: revisão da parte 5
Co-Authored-By: Claude Opus 5.5 <noreply@anthropic.com>
Claude-Session: https://claude.ai/code/session_01MJjUEEZrxQDEUifKK2vj9g
</commit_message>
<xml_diff>
--- a/roteiros/evaristo-costa/EvaristoCosta_Parte5.docx
+++ b/roteiros/evaristo-costa/EvaristoCosta_Parte5.docx
@@ -175,7 +175,7 @@
         <w:rPr>
           <w:color w:val="000000"/>
         </w:rPr>
-        <w:t>Os fãs lotaram os comentários. Para quem tinha acompanhado a UTI, a balança despencando e a frase "eu me sinto definhando", aquela mensagem parecia o final feliz de um filme.</w:t>
+        <w:t>Os comentários se encheram de mensagens de carinho. Para quem tinha acompanhado a UTI, a balança despencando e a frase "eu me sinto definhando", aquela mensagem parecia o final feliz de um filme.</w:t>
       </w:r>
     </w:p>
     <w:p>
@@ -255,7 +255,7 @@
         <w:rPr>
           <w:color w:val="000000"/>
         </w:rPr>
-        <w:t>Pela primeira vez em quase nove anos, a televisão aberta brasileira parecia pronta para receber Evaristo de volta.</w:t>
+        <w:t>Quase nove anos depois de deixar a Globo, a televisão aberta brasileira parecia prestes a receber Evaristo de volta.</w:t>
       </w:r>
     </w:p>
     <w:p>
@@ -375,7 +375,7 @@
         <w:rPr>
           <w:color w:val="000000"/>
         </w:rPr>
-        <w:t>Evaristo não confirmou nem negou nada sobre a própria vida. Fez uma coisa mais rara. Traçou uma linha. Aquilo, a vida íntima dele, não pertencia a ninguém.</w:t>
+        <w:t>Evaristo manteve a própria vida para si. E traçou uma linha que pouca gente famosa tem coragem de traçar em público. A vida íntima dele pertencia só a ele.</w:t>
       </w:r>
     </w:p>
     <w:p>
@@ -383,15 +383,7 @@
         <w:rPr>
           <w:color w:val="C00000"/>
         </w:rPr>
-        <w:t>E repare numa coisa que quase ninguém conectou. Tudo o que você viu até agora, da vergonha de falar do intestino à cobrança sobre a vida íntima, aponta para a mesma ferida. E ela é a verdade mais cruel de toda essa história.</w:t>
-      </w:r>
-    </w:p>
-    <w:p>
-      <w:r>
-        <w:rPr>
-          <w:color w:val="000000"/>
-        </w:rPr>
-        <w:t>Seis meses depois, Evaristo voltou a surpreender.</w:t>
+        <w:t>Mas essa história ainda guardava uma última surpresa. Seis meses depois, o próprio Evaristo ia deixar o Brasil em choque com um anúncio que ninguém esperava ouvir dele.</w:t>
       </w:r>
     </w:p>
     <w:p>
@@ -559,7 +551,7 @@
         <w:rPr>
           <w:color w:val="000000"/>
         </w:rPr>
-        <w:t>Enquanto isso, o homem de verdade ia ao banheiro quarenta vezes por dia e tinha vergonha de contar. E, no pior momento da doença, perdendo meio quilo por dia, ainda lia nos comentários perguntas sobre o casamento e sobre a própria sexualidade.</w:t>
+        <w:t>Enquanto isso, o homem de verdade ia ao banheiro quarenta vezes por dia e tinha vergonha de contar. E, mesmo depois de vencer a pior fase da doença, ainda lia nos comentários palpites sobre o casamento e cobranças sobre a própria sexualidade.</w:t>
       </w:r>
     </w:p>
     <w:p>
@@ -583,7 +575,7 @@
         <w:rPr>
           <w:color w:val="C00000"/>
         </w:rPr>
-        <w:t>Só que existe uma frase de Evaristo, dita no meio de toda essa luta, que muda o sentido de tudo o que você viu até aqui. E explica por que ele decidiu, enfim, expor a parte mais íntima da própria vida.</w:t>
+        <w:t>Há uma frase de Evaristo, dita no meio de toda essa luta, que muda o sentido de tudo o que você viu até aqui. E explica por que ele decidiu, enfim, expor a parte mais íntima da própria vida.</w:t>
       </w:r>
     </w:p>
     <w:p>

</xml_diff>

<commit_message>
Evaristo Costa: variação dos microganchos da parte 5
Co-Authored-By: Claude Opus 5.5 <noreply@anthropic.com>
Claude-Session: https://claude.ai/code/session_01MJjUEEZrxQDEUifKK2vj9g
</commit_message>
<xml_diff>
--- a/roteiros/evaristo-costa/EvaristoCosta_Parte5.docx
+++ b/roteiros/evaristo-costa/EvaristoCosta_Parte5.docx
@@ -383,7 +383,7 @@
         <w:rPr>
           <w:color w:val="C00000"/>
         </w:rPr>
-        <w:t>Mas essa história ainda guardava uma última surpresa. Seis meses depois, o próprio Evaristo ia deixar o Brasil em choque com um anúncio que ninguém esperava ouvir dele.</w:t>
+        <w:t>Essa história ainda guardava uma última surpresa. Seis meses depois, o próprio Evaristo ia deixar o Brasil em choque com um anúncio que ninguém esperava ouvir dele.</w:t>
       </w:r>
     </w:p>
     <w:p>
@@ -455,7 +455,7 @@
         <w:rPr>
           <w:color w:val="C00000"/>
         </w:rPr>
-        <w:t>Mas, antes de chegar aos cinquenta, existe uma verdade que atravessa toda essa história. E ela explica por que o Brasil, durante anos, olhou para Evaristo e não enxergou o que estava bem na frente dos olhos.</w:t>
+        <w:t>Antes de chegar aos cinquenta, existe uma verdade que atravessa toda essa história. E ela explica por que o Brasil, durante anos, olhou para Evaristo e não enxergou o que estava bem na frente dos olhos.</w:t>
       </w:r>
     </w:p>
     <w:p>

</xml_diff>